<commit_message>
SECTION A AND B ANSWERS
</commit_message>
<xml_diff>
--- a/SECTION B.docx
+++ b/SECTION B.docx
@@ -2,6 +2,22 @@
 <file path=word/document.xml><?xml version="1.0" encoding="utf-8"?>
 <w:document xmlns:wpc="http://schemas.microsoft.com/office/word/2010/wordprocessingCanvas" xmlns:cx="http://schemas.microsoft.com/office/drawing/2014/chartex" xmlns:cx1="http://schemas.microsoft.com/office/drawing/2015/9/8/chartex" xmlns:cx2="http://schemas.microsoft.com/office/drawing/2015/10/21/chartex" xmlns:cx3="http://schemas.microsoft.com/office/drawing/2016/5/9/chartex" xmlns:cx4="http://schemas.microsoft.com/office/drawing/2016/5/10/chartex" xmlns:cx5="http://schemas.microsoft.com/office/drawing/2016/5/11/chartex" xmlns:cx6="http://schemas.microsoft.com/office/drawing/2016/5/12/chartex" xmlns:cx7="http://schemas.microsoft.com/office/drawing/2016/5/13/chartex" xmlns:cx8="http://schemas.microsoft.com/office/drawing/2016/5/14/chartex" xmlns:mc="http://schemas.openxmlformats.org/markup-compatibility/2006" xmlns:aink="http://schemas.microsoft.com/office/drawing/2016/ink" xmlns:am3d="http://schemas.microsoft.com/office/drawing/2017/model3d" xmlns:o="urn:schemas-microsoft-com:office:office" xmlns:oel="http://schemas.microsoft.com/office/2019/extlst" xmlns:r="http://schemas.openxmlformats.org/officeDocument/2006/relationships" xmlns:m="http://schemas.openxmlformats.org/officeDocument/2006/math" xmlns:v="urn:schemas-microsoft-com:vml" xmlns:wp14="http://schemas.microsoft.com/office/word/2010/wordprocessingDrawing" xmlns:wp="http://schemas.openxmlformats.org/drawingml/2006/wordprocessingDrawing" xmlns:w10="urn:schemas-microsoft-com:office:word" xmlns:w="http://schemas.openxmlformats.org/wordprocessingml/2006/main" xmlns:w14="http://schemas.microsoft.com/office/word/2010/wordml" xmlns:w15="http://schemas.microsoft.com/office/word/2012/wordml" xmlns:w16cex="http://schemas.microsoft.com/office/word/2018/wordml/cex" xmlns:w16cid="http://schemas.microsoft.com/office/word/2016/wordml/cid" xmlns:w16="http://schemas.microsoft.com/office/word/2018/wordml" xmlns:w16du="http://schemas.microsoft.com/office/word/2023/wordml/word16du" xmlns:w16sdtdh="http://schemas.microsoft.com/office/word/2020/wordml/sdtdatahash" xmlns:w16sdtfl="http://schemas.microsoft.com/office/word/2024/wordml/sdtformatlock" xmlns:w16se="http://schemas.microsoft.com/office/word/2015/wordml/symex" xmlns:wpg="http://schemas.microsoft.com/office/word/2010/wordprocessingGroup" xmlns:wpi="http://schemas.microsoft.com/office/word/2010/wordprocessingInk" xmlns:wne="http://schemas.microsoft.com/office/word/2006/wordml" xmlns:wps="http://schemas.microsoft.com/office/word/2010/wordprocessingShape" mc:Ignorable="w14 w15 w16se w16cid w16 w16cex w16sdtdh w16sdtfl w16du wp14">
   <w:body>
+    <w:p>
+      <w:pPr>
+        <w:rPr>
+          <w:b/>
+          <w:bCs/>
+        </w:rPr>
+      </w:pPr>
+      <w:r>
+        <w:rPr>
+          <w:b/>
+          <w:bCs/>
+        </w:rPr>
+        <w:t>TSHABUSE LIVHUWANI</w:t>
+      </w:r>
+    </w:p>
+    <w:p/>
     <w:p>
       <w:r>
         <w:t>SECTION B</w:t>
@@ -46,17 +62,263 @@
           <w:numId w:val="1"/>
         </w:numPr>
         <w:rPr>
+          <w:b/>
+          <w:bCs/>
+        </w:rPr>
+      </w:pPr>
+      <w:r>
+        <w:rPr>
+          <w:b/>
+          <w:bCs/>
+        </w:rPr>
+        <w:t>Class_</w:t>
+      </w:r>
+      <w:proofErr w:type="gramStart"/>
+      <w:r>
+        <w:rPr>
+          <w:b/>
+          <w:bCs/>
+        </w:rPr>
+        <w:t>Initialize(</w:t>
+      </w:r>
+      <w:proofErr w:type="gramEnd"/>
+      <w:r>
+        <w:rPr>
+          <w:b/>
+          <w:bCs/>
+        </w:rPr>
+        <w:t>)</w:t>
+      </w:r>
+    </w:p>
+    <w:p>
+      <w:pPr>
+        <w:pStyle w:val="ListParagraph"/>
+        <w:rPr>
+          <w:b/>
+          <w:bCs/>
+        </w:rPr>
+      </w:pPr>
+    </w:p>
+    <w:tbl>
+      <w:tblPr>
+        <w:tblStyle w:val="TableGrid"/>
+        <w:tblW w:w="0" w:type="auto"/>
+        <w:tblLook w:val="04A0" w:firstRow="1" w:lastRow="0" w:firstColumn="1" w:lastColumn="0" w:noHBand="0" w:noVBand="1"/>
+      </w:tblPr>
+      <w:tblGrid>
+        <w:gridCol w:w="1870"/>
+        <w:gridCol w:w="1870"/>
+        <w:gridCol w:w="1870"/>
+        <w:gridCol w:w="1870"/>
+        <w:gridCol w:w="1870"/>
+      </w:tblGrid>
+      <w:tr>
+        <w:tc>
+          <w:tcPr>
+            <w:tcW w:w="1870" w:type="dxa"/>
+          </w:tcPr>
+          <w:p>
+            <w:pPr>
+              <w:rPr>
+                <w:b/>
+                <w:bCs/>
+              </w:rPr>
+            </w:pPr>
+            <w:r>
+              <w:rPr>
+                <w:b/>
+                <w:bCs/>
+              </w:rPr>
+              <w:t>TC</w:t>
+            </w:r>
+          </w:p>
+        </w:tc>
+        <w:tc>
+          <w:tcPr>
+            <w:tcW w:w="1870" w:type="dxa"/>
+          </w:tcPr>
+          <w:p>
+            <w:pPr>
+              <w:rPr>
+                <w:b/>
+                <w:bCs/>
+              </w:rPr>
+            </w:pPr>
+            <w:r>
+              <w:rPr>
+                <w:b/>
+                <w:bCs/>
+              </w:rPr>
+              <w:t>Input Values</w:t>
+            </w:r>
+          </w:p>
+        </w:tc>
+        <w:tc>
+          <w:tcPr>
+            <w:tcW w:w="1870" w:type="dxa"/>
+          </w:tcPr>
+          <w:p>
+            <w:pPr>
+              <w:rPr>
+                <w:b/>
+                <w:bCs/>
+              </w:rPr>
+            </w:pPr>
+            <w:r>
+              <w:rPr>
+                <w:b/>
+                <w:bCs/>
+              </w:rPr>
+              <w:t>Expected Results</w:t>
+            </w:r>
+          </w:p>
+        </w:tc>
+        <w:tc>
+          <w:tcPr>
+            <w:tcW w:w="1870" w:type="dxa"/>
+          </w:tcPr>
+          <w:p>
+            <w:pPr>
+              <w:rPr>
+                <w:b/>
+                <w:bCs/>
+              </w:rPr>
+            </w:pPr>
+            <w:r>
+              <w:rPr>
+                <w:b/>
+                <w:bCs/>
+              </w:rPr>
+              <w:t>Statement Coverage</w:t>
+            </w:r>
+          </w:p>
+        </w:tc>
+        <w:tc>
+          <w:tcPr>
+            <w:tcW w:w="1870" w:type="dxa"/>
+          </w:tcPr>
+          <w:p>
+            <w:pPr>
+              <w:rPr>
+                <w:b/>
+                <w:bCs/>
+              </w:rPr>
+            </w:pPr>
+            <w:r>
+              <w:rPr>
+                <w:b/>
+                <w:bCs/>
+              </w:rPr>
+              <w:t>Branch Coverage</w:t>
+            </w:r>
+          </w:p>
+        </w:tc>
+      </w:tr>
+      <w:tr>
+        <w:tc>
+          <w:tcPr>
+            <w:tcW w:w="1870" w:type="dxa"/>
+          </w:tcPr>
+          <w:p>
+            <w:r>
+              <w:t>TC</w:t>
+            </w:r>
+            <w:r>
+              <w:t>1</w:t>
+            </w:r>
+          </w:p>
+        </w:tc>
+        <w:tc>
+          <w:tcPr>
+            <w:tcW w:w="1870" w:type="dxa"/>
+          </w:tcPr>
+          <w:p>
+            <w:proofErr w:type="gramStart"/>
+            <w:r>
+              <w:t>Create</w:t>
+            </w:r>
+            <w:proofErr w:type="gramEnd"/>
+            <w:r>
+              <w:t xml:space="preserve"> new Account</w:t>
+            </w:r>
+          </w:p>
+        </w:tc>
+        <w:tc>
+          <w:tcPr>
+            <w:tcW w:w="1870" w:type="dxa"/>
+          </w:tcPr>
+          <w:p>
+            <w:r>
+              <w:t>Account Initial</w:t>
+            </w:r>
+            <w:r>
+              <w:t xml:space="preserve"> balance is R1000</w:t>
+            </w:r>
+          </w:p>
+        </w:tc>
+        <w:tc>
+          <w:tcPr>
+            <w:tcW w:w="1870" w:type="dxa"/>
+          </w:tcPr>
+          <w:p/>
+          <w:p>
+            <w:pPr>
+              <w:jc w:val="center"/>
+            </w:pPr>
+            <w:r>
+              <w:t>100%</w:t>
+            </w:r>
+          </w:p>
+        </w:tc>
+        <w:tc>
+          <w:tcPr>
+            <w:tcW w:w="1870" w:type="dxa"/>
+          </w:tcPr>
+          <w:p/>
+          <w:p>
+            <w:pPr>
+              <w:jc w:val="center"/>
+            </w:pPr>
+            <w:r>
+              <w:t>100%</w:t>
+            </w:r>
+          </w:p>
+        </w:tc>
+      </w:tr>
+    </w:tbl>
+    <w:p>
+      <w:pPr>
+        <w:pStyle w:val="ListParagraph"/>
+        <w:rPr>
           <w:u w:val="single"/>
         </w:rPr>
       </w:pPr>
-      <w:r>
-        <w:rPr>
+    </w:p>
+    <w:p>
+      <w:pPr>
+        <w:pStyle w:val="ListParagraph"/>
+        <w:numPr>
+          <w:ilvl w:val="0"/>
+          <w:numId w:val="1"/>
+        </w:numPr>
+        <w:rPr>
+          <w:b/>
+          <w:bCs/>
           <w:u w:val="single"/>
         </w:rPr>
+      </w:pPr>
+      <w:r>
+        <w:rPr>
+          <w:b/>
+          <w:bCs/>
+          <w:u w:val="single"/>
+        </w:rPr>
         <w:t>Withdrawal (</w:t>
       </w:r>
       <w:r>
         <w:rPr>
+          <w:b/>
+          <w:bCs/>
           <w:u w:val="single"/>
         </w:rPr>
         <w:t>)</w:t>
@@ -195,6 +457,9 @@
           </w:tcPr>
           <w:p>
             <w:r>
+              <w:t xml:space="preserve">Withdrew </w:t>
+            </w:r>
+            <w:r>
               <w:t>Amount = R500, Balance = R1000</w:t>
             </w:r>
           </w:p>
@@ -215,80 +480,23 @@
           </w:tcPr>
           <w:p>
             <w:r>
-              <w:t>50%</w:t>
-            </w:r>
-          </w:p>
-        </w:tc>
-        <w:tc>
-          <w:tcPr>
-            <w:tcW w:w="1870" w:type="dxa"/>
-          </w:tcPr>
-          <w:p>
-            <w:r>
-              <w:t>50%</w:t>
-            </w:r>
-          </w:p>
-        </w:tc>
-      </w:tr>
-      <w:tr>
-        <w:tc>
-          <w:tcPr>
-            <w:tcW w:w="1870" w:type="dxa"/>
-          </w:tcPr>
-          <w:p>
-            <w:r>
-              <w:t>TC</w:t>
-            </w:r>
-            <w:r>
-              <w:t>2</w:t>
-            </w:r>
-          </w:p>
-        </w:tc>
-        <w:tc>
-          <w:tcPr>
-            <w:tcW w:w="1870" w:type="dxa"/>
-          </w:tcPr>
-          <w:p>
-            <w:r>
-              <w:t>Amount = R1500, Balance = R1000</w:t>
-            </w:r>
-          </w:p>
-        </w:tc>
-        <w:tc>
-          <w:tcPr>
-            <w:tcW w:w="1870" w:type="dxa"/>
-          </w:tcPr>
-          <w:p>
-            <w:r>
-              <w:t>Withdrawal rejected, Insufficient funds</w:t>
-            </w:r>
-          </w:p>
-        </w:tc>
-        <w:tc>
-          <w:tcPr>
-            <w:tcW w:w="1870" w:type="dxa"/>
-          </w:tcPr>
-          <w:p/>
-          <w:p>
-            <w:pPr>
-              <w:jc w:val="center"/>
-            </w:pPr>
-            <w:r>
-              <w:t>100%</w:t>
-            </w:r>
-          </w:p>
-        </w:tc>
-        <w:tc>
-          <w:tcPr>
-            <w:tcW w:w="1870" w:type="dxa"/>
-          </w:tcPr>
-          <w:p/>
-          <w:p>
-            <w:pPr>
-              <w:jc w:val="center"/>
-            </w:pPr>
-            <w:r>
-              <w:t>100%</w:t>
+              <w:t>10</w:t>
+            </w:r>
+            <w:r>
+              <w:t>0%</w:t>
+            </w:r>
+          </w:p>
+        </w:tc>
+        <w:tc>
+          <w:tcPr>
+            <w:tcW w:w="1870" w:type="dxa"/>
+          </w:tcPr>
+          <w:p>
+            <w:r>
+              <w:t>10</w:t>
+            </w:r>
+            <w:r>
+              <w:t>0%</w:t>
             </w:r>
           </w:p>
         </w:tc>
@@ -303,23 +511,23 @@
           <w:numId w:val="1"/>
         </w:numPr>
         <w:rPr>
+          <w:b/>
+          <w:bCs/>
           <w:u w:val="single"/>
         </w:rPr>
       </w:pPr>
       <w:r>
         <w:rPr>
+          <w:b/>
+          <w:bCs/>
           <w:u w:val="single"/>
         </w:rPr>
-        <w:t>Deposit</w:t>
-      </w:r>
-      <w:r>
-        <w:rPr>
-          <w:u w:val="single"/>
-        </w:rPr>
-        <w:t xml:space="preserve"> (</w:t>
-      </w:r>
-      <w:r>
-        <w:rPr>
+        <w:t>Deposit (</w:t>
+      </w:r>
+      <w:r>
+        <w:rPr>
+          <w:b/>
+          <w:bCs/>
           <w:u w:val="single"/>
         </w:rPr>
         <w:t>)</w:t>
@@ -472,128 +680,57 @@
               <w:t>Amount = R500</w:t>
             </w:r>
           </w:p>
-        </w:tc>
-        <w:tc>
-          <w:tcPr>
-            <w:tcW w:w="1870" w:type="dxa"/>
-          </w:tcPr>
-          <w:p>
-            <w:pPr>
-              <w:spacing w:after="160" w:line="278" w:lineRule="auto"/>
-            </w:pPr>
-            <w:r>
-              <w:t>Deposit successful, Balance increased</w:t>
-            </w:r>
-          </w:p>
-        </w:tc>
-        <w:tc>
-          <w:tcPr>
-            <w:tcW w:w="1870" w:type="dxa"/>
-          </w:tcPr>
-          <w:p>
-            <w:pPr>
-              <w:spacing w:after="160" w:line="278" w:lineRule="auto"/>
-            </w:pPr>
-            <w:r>
-              <w:t>50%</w:t>
-            </w:r>
-          </w:p>
-        </w:tc>
-        <w:tc>
-          <w:tcPr>
-            <w:tcW w:w="1870" w:type="dxa"/>
-          </w:tcPr>
-          <w:p>
-            <w:pPr>
-              <w:spacing w:after="160" w:line="278" w:lineRule="auto"/>
-            </w:pPr>
-            <w:r>
-              <w:t>50%</w:t>
-            </w:r>
-          </w:p>
-        </w:tc>
-      </w:tr>
-      <w:tr>
-        <w:tc>
-          <w:tcPr>
-            <w:tcW w:w="1870" w:type="dxa"/>
-          </w:tcPr>
-          <w:p>
-            <w:pPr>
-              <w:spacing w:after="160" w:line="278" w:lineRule="auto"/>
-            </w:pPr>
-            <w:r>
-              <w:t>TC2</w:t>
-            </w:r>
-          </w:p>
-        </w:tc>
-        <w:tc>
-          <w:tcPr>
-            <w:tcW w:w="1870" w:type="dxa"/>
-          </w:tcPr>
-          <w:p>
-            <w:pPr>
-              <w:spacing w:after="160" w:line="278" w:lineRule="auto"/>
-            </w:pPr>
-            <w:r>
-              <w:t xml:space="preserve">Amount = </w:t>
-            </w:r>
-            <w:r>
-              <w:t>0</w:t>
-            </w:r>
-          </w:p>
-        </w:tc>
-        <w:tc>
-          <w:tcPr>
-            <w:tcW w:w="1870" w:type="dxa"/>
-          </w:tcPr>
-          <w:p>
-            <w:pPr>
-              <w:spacing w:after="160" w:line="278" w:lineRule="auto"/>
-            </w:pPr>
-            <w:r>
-              <w:t>Deposit rejected</w:t>
-            </w:r>
-          </w:p>
-          <w:p>
-            <w:pPr>
-              <w:spacing w:after="160" w:line="278" w:lineRule="auto"/>
-            </w:pPr>
-          </w:p>
-        </w:tc>
-        <w:tc>
-          <w:tcPr>
-            <w:tcW w:w="1870" w:type="dxa"/>
-          </w:tcPr>
-          <w:p>
-            <w:pPr>
-              <w:spacing w:after="160" w:line="278" w:lineRule="auto"/>
-            </w:pPr>
-          </w:p>
-          <w:p>
-            <w:pPr>
-              <w:spacing w:after="160" w:line="278" w:lineRule="auto"/>
-            </w:pPr>
-            <w:r>
-              <w:t>100%</w:t>
-            </w:r>
-          </w:p>
-        </w:tc>
-        <w:tc>
-          <w:tcPr>
-            <w:tcW w:w="1870" w:type="dxa"/>
-          </w:tcPr>
-          <w:p>
-            <w:pPr>
-              <w:spacing w:after="160" w:line="278" w:lineRule="auto"/>
-            </w:pPr>
-          </w:p>
-          <w:p>
-            <w:pPr>
-              <w:spacing w:after="160" w:line="278" w:lineRule="auto"/>
-            </w:pPr>
-            <w:r>
-              <w:t>100%</w:t>
+          <w:p>
+            <w:pPr>
+              <w:spacing w:after="160" w:line="278" w:lineRule="auto"/>
+            </w:pPr>
+            <w:r>
+              <w:t>Balance = R1000</w:t>
+            </w:r>
+          </w:p>
+        </w:tc>
+        <w:tc>
+          <w:tcPr>
+            <w:tcW w:w="1870" w:type="dxa"/>
+          </w:tcPr>
+          <w:p>
+            <w:pPr>
+              <w:spacing w:after="160" w:line="278" w:lineRule="auto"/>
+            </w:pPr>
+            <w:r>
+              <w:t>Deposit successful, Balance = R1500</w:t>
+            </w:r>
+          </w:p>
+        </w:tc>
+        <w:tc>
+          <w:tcPr>
+            <w:tcW w:w="1870" w:type="dxa"/>
+          </w:tcPr>
+          <w:p>
+            <w:pPr>
+              <w:spacing w:after="160" w:line="278" w:lineRule="auto"/>
+            </w:pPr>
+            <w:r>
+              <w:t>10</w:t>
+            </w:r>
+            <w:r>
+              <w:t>0%</w:t>
+            </w:r>
+          </w:p>
+        </w:tc>
+        <w:tc>
+          <w:tcPr>
+            <w:tcW w:w="1870" w:type="dxa"/>
+          </w:tcPr>
+          <w:p>
+            <w:pPr>
+              <w:spacing w:after="160" w:line="278" w:lineRule="auto"/>
+            </w:pPr>
+            <w:r>
+              <w:t>10</w:t>
+            </w:r>
+            <w:r>
+              <w:t>0%</w:t>
             </w:r>
           </w:p>
         </w:tc>
@@ -611,14 +748,17 @@
           <w:numId w:val="1"/>
         </w:numPr>
         <w:rPr>
+          <w:b/>
+          <w:bCs/>
           <w:u w:val="single"/>
         </w:rPr>
       </w:pPr>
       <w:r>
         <w:rPr>
+          <w:b/>
+          <w:bCs/>
           <w:u w:val="single"/>
         </w:rPr>
-        <w:lastRenderedPageBreak/>
         <w:t>Transfer ()</w:t>
       </w:r>
     </w:p>
@@ -766,6 +906,12 @@
               <w:spacing w:after="160" w:line="278" w:lineRule="auto"/>
             </w:pPr>
             <w:r>
+              <w:t>Receiving</w:t>
+            </w:r>
+            <w:r>
+              <w:t xml:space="preserve"> </w:t>
+            </w:r>
+            <w:r>
               <w:t>Account = 765</w:t>
             </w:r>
             <w:r>
@@ -814,127 +960,26 @@
               <w:spacing w:after="160" w:line="278" w:lineRule="auto"/>
             </w:pPr>
             <w:r>
-              <w:t>50%</w:t>
-            </w:r>
-          </w:p>
-        </w:tc>
-        <w:tc>
-          <w:tcPr>
-            <w:tcW w:w="1870" w:type="dxa"/>
-          </w:tcPr>
-          <w:p>
-            <w:pPr>
-              <w:spacing w:after="160" w:line="278" w:lineRule="auto"/>
-            </w:pPr>
-            <w:r>
-              <w:t>50%</w:t>
-            </w:r>
-          </w:p>
-        </w:tc>
-      </w:tr>
-      <w:tr>
-        <w:tc>
-          <w:tcPr>
-            <w:tcW w:w="1870" w:type="dxa"/>
-          </w:tcPr>
-          <w:p>
-            <w:pPr>
-              <w:spacing w:after="160" w:line="278" w:lineRule="auto"/>
-            </w:pPr>
-            <w:r>
-              <w:t>TC2</w:t>
-            </w:r>
-          </w:p>
-        </w:tc>
-        <w:tc>
-          <w:tcPr>
-            <w:tcW w:w="1870" w:type="dxa"/>
-          </w:tcPr>
-          <w:p>
-            <w:pPr>
-              <w:spacing w:after="160" w:line="278" w:lineRule="auto"/>
-            </w:pPr>
-            <w:r>
-              <w:t xml:space="preserve">Account = </w:t>
-            </w:r>
-            <w:proofErr w:type="gramStart"/>
-            <w:r>
-              <w:t>765</w:t>
-            </w:r>
-            <w:r>
-              <w:t>7</w:t>
-            </w:r>
-            <w:r>
-              <w:t>3</w:t>
-            </w:r>
-            <w:r>
-              <w:t>79</w:t>
-            </w:r>
-            <w:r>
-              <w:t>,,</w:t>
-            </w:r>
-            <w:proofErr w:type="gramEnd"/>
-            <w:r>
-              <w:t xml:space="preserve"> Amount = R1500, Balance = R1000</w:t>
-            </w:r>
-          </w:p>
-          <w:p>
-            <w:pPr>
-              <w:spacing w:after="160" w:line="278" w:lineRule="auto"/>
-            </w:pPr>
-          </w:p>
-        </w:tc>
-        <w:tc>
-          <w:tcPr>
-            <w:tcW w:w="1870" w:type="dxa"/>
-          </w:tcPr>
-          <w:p>
-            <w:pPr>
-              <w:spacing w:after="160" w:line="278" w:lineRule="auto"/>
-            </w:pPr>
-            <w:r>
-              <w:t>Transfer rejected, Insufficient funds</w:t>
-            </w:r>
-          </w:p>
-          <w:p>
-            <w:pPr>
-              <w:spacing w:after="160" w:line="278" w:lineRule="auto"/>
-            </w:pPr>
-          </w:p>
-        </w:tc>
-        <w:tc>
-          <w:tcPr>
-            <w:tcW w:w="1870" w:type="dxa"/>
-          </w:tcPr>
-          <w:p>
-            <w:pPr>
-              <w:spacing w:after="160" w:line="278" w:lineRule="auto"/>
-            </w:pPr>
-          </w:p>
-          <w:p>
-            <w:pPr>
-              <w:spacing w:after="160" w:line="278" w:lineRule="auto"/>
-            </w:pPr>
-            <w:r>
-              <w:t>100%</w:t>
-            </w:r>
-          </w:p>
-        </w:tc>
-        <w:tc>
-          <w:tcPr>
-            <w:tcW w:w="1870" w:type="dxa"/>
-          </w:tcPr>
-          <w:p>
-            <w:pPr>
-              <w:spacing w:after="160" w:line="278" w:lineRule="auto"/>
-            </w:pPr>
-          </w:p>
-          <w:p>
-            <w:pPr>
-              <w:spacing w:after="160" w:line="278" w:lineRule="auto"/>
-            </w:pPr>
-            <w:r>
-              <w:t>100%</w:t>
+              <w:t>10</w:t>
+            </w:r>
+            <w:r>
+              <w:t>0%</w:t>
+            </w:r>
+          </w:p>
+        </w:tc>
+        <w:tc>
+          <w:tcPr>
+            <w:tcW w:w="1870" w:type="dxa"/>
+          </w:tcPr>
+          <w:p>
+            <w:pPr>
+              <w:spacing w:after="160" w:line="278" w:lineRule="auto"/>
+            </w:pPr>
+            <w:r>
+              <w:t>10</w:t>
+            </w:r>
+            <w:r>
+              <w:t>0%</w:t>
             </w:r>
           </w:p>
         </w:tc>
@@ -1166,10 +1211,7 @@
               </w:rPr>
             </w:pPr>
             <w:r>
-              <w:t>C</w:t>
-            </w:r>
-            <w:r>
-              <w:t>urrent Balance displayed as R1000</w:t>
+              <w:t>Message box displays Current Balance: R1000.00</w:t>
             </w:r>
           </w:p>
         </w:tc>
@@ -1242,6 +1284,15 @@
     </w:p>
     <w:p/>
     <w:p/>
+    <w:p>
+      <w:pPr>
+        <w:pStyle w:val="ListParagraph"/>
+        <w:rPr>
+          <w:b/>
+          <w:bCs/>
+        </w:rPr>
+      </w:pPr>
+    </w:p>
     <w:p>
       <w:pPr>
         <w:pStyle w:val="ListParagraph"/>
@@ -1249,30 +1300,45 @@
           <w:ilvl w:val="0"/>
           <w:numId w:val="1"/>
         </w:numPr>
+        <w:rPr>
+          <w:b/>
+          <w:bCs/>
+        </w:rPr>
       </w:pPr>
       <w:proofErr w:type="spellStart"/>
       <w:proofErr w:type="gramStart"/>
       <w:r>
+        <w:rPr>
+          <w:b/>
+          <w:bCs/>
+        </w:rPr>
         <w:lastRenderedPageBreak/>
-        <w:t>getAccountDetails</w:t>
+        <w:t>getAccountNumber</w:t>
       </w:r>
       <w:proofErr w:type="spellEnd"/>
       <w:r>
+        <w:rPr>
+          <w:b/>
+          <w:bCs/>
+        </w:rPr>
         <w:t>(</w:t>
       </w:r>
       <w:proofErr w:type="gramEnd"/>
       <w:r>
+        <w:rPr>
+          <w:b/>
+          <w:bCs/>
+        </w:rPr>
         <w:t>)</w:t>
       </w:r>
     </w:p>
     <w:p>
       <w:pPr>
         <w:pStyle w:val="ListParagraph"/>
-      </w:pPr>
-    </w:p>
-    <w:p>
-      <w:pPr>
-        <w:pStyle w:val="ListParagraph"/>
+        <w:rPr>
+          <w:b/>
+          <w:bCs/>
+        </w:rPr>
       </w:pPr>
     </w:p>
     <w:tbl>
@@ -1426,6 +1492,286 @@
               <w:spacing w:after="160" w:line="278" w:lineRule="auto"/>
             </w:pPr>
             <w:r>
+              <w:t>Account Number = 14578291</w:t>
+            </w:r>
+          </w:p>
+        </w:tc>
+        <w:tc>
+          <w:tcPr>
+            <w:tcW w:w="1870" w:type="dxa"/>
+          </w:tcPr>
+          <w:p>
+            <w:pPr>
+              <w:spacing w:after="160" w:line="278" w:lineRule="auto"/>
+              <w:rPr>
+                <w:b/>
+                <w:bCs/>
+              </w:rPr>
+            </w:pPr>
+            <w:r>
+              <w:t>Returns ACC-14578291</w:t>
+            </w:r>
+          </w:p>
+        </w:tc>
+        <w:tc>
+          <w:tcPr>
+            <w:tcW w:w="1870" w:type="dxa"/>
+          </w:tcPr>
+          <w:p>
+            <w:pPr>
+              <w:spacing w:after="160" w:line="278" w:lineRule="auto"/>
+              <w:rPr>
+                <w:b/>
+                <w:bCs/>
+              </w:rPr>
+            </w:pPr>
+            <w:r>
+              <w:rPr>
+                <w:b/>
+                <w:bCs/>
+              </w:rPr>
+              <w:t>100%</w:t>
+            </w:r>
+          </w:p>
+        </w:tc>
+        <w:tc>
+          <w:tcPr>
+            <w:tcW w:w="1870" w:type="dxa"/>
+          </w:tcPr>
+          <w:p>
+            <w:pPr>
+              <w:spacing w:after="160" w:line="278" w:lineRule="auto"/>
+              <w:rPr>
+                <w:b/>
+                <w:bCs/>
+              </w:rPr>
+            </w:pPr>
+            <w:r>
+              <w:rPr>
+                <w:b/>
+                <w:bCs/>
+              </w:rPr>
+              <w:t>100%</w:t>
+            </w:r>
+          </w:p>
+        </w:tc>
+      </w:tr>
+    </w:tbl>
+    <w:p>
+      <w:pPr>
+        <w:rPr>
+          <w:b/>
+          <w:bCs/>
+        </w:rPr>
+      </w:pPr>
+    </w:p>
+    <w:p>
+      <w:pPr>
+        <w:rPr>
+          <w:b/>
+          <w:bCs/>
+        </w:rPr>
+      </w:pPr>
+    </w:p>
+    <w:p>
+      <w:pPr>
+        <w:pStyle w:val="ListParagraph"/>
+        <w:numPr>
+          <w:ilvl w:val="0"/>
+          <w:numId w:val="1"/>
+        </w:numPr>
+        <w:rPr>
+          <w:b/>
+          <w:bCs/>
+        </w:rPr>
+      </w:pPr>
+      <w:proofErr w:type="spellStart"/>
+      <w:proofErr w:type="gramStart"/>
+      <w:r>
+        <w:rPr>
+          <w:b/>
+          <w:bCs/>
+        </w:rPr>
+        <w:t>getAccountDetails</w:t>
+      </w:r>
+      <w:proofErr w:type="spellEnd"/>
+      <w:r>
+        <w:rPr>
+          <w:b/>
+          <w:bCs/>
+        </w:rPr>
+        <w:t>(</w:t>
+      </w:r>
+      <w:proofErr w:type="gramEnd"/>
+      <w:r>
+        <w:rPr>
+          <w:b/>
+          <w:bCs/>
+        </w:rPr>
+        <w:t>)</w:t>
+      </w:r>
+    </w:p>
+    <w:p>
+      <w:pPr>
+        <w:pStyle w:val="ListParagraph"/>
+      </w:pPr>
+    </w:p>
+    <w:p>
+      <w:pPr>
+        <w:pStyle w:val="ListParagraph"/>
+      </w:pPr>
+    </w:p>
+    <w:tbl>
+      <w:tblPr>
+        <w:tblStyle w:val="TableGrid"/>
+        <w:tblW w:w="0" w:type="auto"/>
+        <w:tblLook w:val="04A0" w:firstRow="1" w:lastRow="0" w:firstColumn="1" w:lastColumn="0" w:noHBand="0" w:noVBand="1"/>
+      </w:tblPr>
+      <w:tblGrid>
+        <w:gridCol w:w="1870"/>
+        <w:gridCol w:w="1870"/>
+        <w:gridCol w:w="1870"/>
+        <w:gridCol w:w="1870"/>
+        <w:gridCol w:w="1870"/>
+      </w:tblGrid>
+      <w:tr>
+        <w:tc>
+          <w:tcPr>
+            <w:tcW w:w="1870" w:type="dxa"/>
+          </w:tcPr>
+          <w:p>
+            <w:pPr>
+              <w:spacing w:after="160" w:line="278" w:lineRule="auto"/>
+              <w:rPr>
+                <w:b/>
+                <w:bCs/>
+              </w:rPr>
+            </w:pPr>
+            <w:r>
+              <w:rPr>
+                <w:b/>
+                <w:bCs/>
+              </w:rPr>
+              <w:t>TC</w:t>
+            </w:r>
+          </w:p>
+        </w:tc>
+        <w:tc>
+          <w:tcPr>
+            <w:tcW w:w="1870" w:type="dxa"/>
+          </w:tcPr>
+          <w:p>
+            <w:pPr>
+              <w:spacing w:after="160" w:line="278" w:lineRule="auto"/>
+              <w:rPr>
+                <w:b/>
+                <w:bCs/>
+              </w:rPr>
+            </w:pPr>
+            <w:r>
+              <w:rPr>
+                <w:b/>
+                <w:bCs/>
+              </w:rPr>
+              <w:t>Input Values</w:t>
+            </w:r>
+          </w:p>
+        </w:tc>
+        <w:tc>
+          <w:tcPr>
+            <w:tcW w:w="1870" w:type="dxa"/>
+          </w:tcPr>
+          <w:p>
+            <w:pPr>
+              <w:spacing w:after="160" w:line="278" w:lineRule="auto"/>
+              <w:rPr>
+                <w:b/>
+                <w:bCs/>
+              </w:rPr>
+            </w:pPr>
+            <w:r>
+              <w:rPr>
+                <w:b/>
+                <w:bCs/>
+              </w:rPr>
+              <w:t>Expected Results</w:t>
+            </w:r>
+          </w:p>
+        </w:tc>
+        <w:tc>
+          <w:tcPr>
+            <w:tcW w:w="1870" w:type="dxa"/>
+          </w:tcPr>
+          <w:p>
+            <w:pPr>
+              <w:spacing w:after="160" w:line="278" w:lineRule="auto"/>
+              <w:rPr>
+                <w:b/>
+                <w:bCs/>
+              </w:rPr>
+            </w:pPr>
+            <w:r>
+              <w:rPr>
+                <w:b/>
+                <w:bCs/>
+              </w:rPr>
+              <w:t>Statement Coverage</w:t>
+            </w:r>
+          </w:p>
+        </w:tc>
+        <w:tc>
+          <w:tcPr>
+            <w:tcW w:w="1870" w:type="dxa"/>
+          </w:tcPr>
+          <w:p>
+            <w:pPr>
+              <w:spacing w:after="160" w:line="278" w:lineRule="auto"/>
+              <w:rPr>
+                <w:b/>
+                <w:bCs/>
+              </w:rPr>
+            </w:pPr>
+            <w:r>
+              <w:rPr>
+                <w:b/>
+                <w:bCs/>
+              </w:rPr>
+              <w:t>Branch Coverage</w:t>
+            </w:r>
+          </w:p>
+        </w:tc>
+      </w:tr>
+      <w:tr>
+        <w:tc>
+          <w:tcPr>
+            <w:tcW w:w="1870" w:type="dxa"/>
+          </w:tcPr>
+          <w:p>
+            <w:pPr>
+              <w:spacing w:after="160" w:line="278" w:lineRule="auto"/>
+              <w:rPr>
+                <w:b/>
+                <w:bCs/>
+              </w:rPr>
+            </w:pPr>
+            <w:r>
+              <w:rPr>
+                <w:b/>
+                <w:bCs/>
+              </w:rPr>
+              <w:t>TC1</w:t>
+            </w:r>
+          </w:p>
+        </w:tc>
+        <w:tc>
+          <w:tcPr>
+            <w:tcW w:w="1870" w:type="dxa"/>
+          </w:tcPr>
+          <w:p>
+            <w:pPr>
+              <w:spacing w:after="160" w:line="278" w:lineRule="auto"/>
+            </w:pPr>
+            <w:r>
               <w:t xml:space="preserve">Account </w:t>
             </w:r>
             <w:r>
@@ -1466,7 +1812,7 @@
               </w:rPr>
             </w:pPr>
             <w:r>
-              <w:t>Current Balance displayed as R1000</w:t>
+              <w:t>Displays account holder, account number and remaining balance</w:t>
             </w:r>
           </w:p>
         </w:tc>
@@ -1856,7 +2202,6 @@
           <w:b/>
           <w:bCs/>
         </w:rPr>
-        <w:lastRenderedPageBreak/>
         <w:t>2.3 Expected Results</w:t>
       </w:r>
     </w:p>
@@ -2452,6 +2797,7 @@
           </w:tcPr>
           <w:p>
             <w:r>
+              <w:lastRenderedPageBreak/>
               <w:t>Result</w:t>
             </w:r>
           </w:p>
@@ -2557,7 +2903,6 @@
           <w:b/>
           <w:bCs/>
         </w:rPr>
-        <w:lastRenderedPageBreak/>
         <w:t>Branch Coverage</w:t>
       </w:r>
     </w:p>
@@ -2849,6 +3194,7 @@
           <w:b/>
           <w:bCs/>
         </w:rPr>
+        <w:lastRenderedPageBreak/>
         <w:t>Correct:</w:t>
       </w:r>
     </w:p>
@@ -3121,6 +3467,7 @@
     </w:p>
     <w:p>
       <w:r>
+        <w:lastRenderedPageBreak/>
         <w:t xml:space="preserve">   Test the </w:t>
       </w:r>
       <w:proofErr w:type="spellStart"/>
@@ -3350,7 +3697,7 @@
 <file path=word/numbering.xml><?xml version="1.0" encoding="utf-8"?>
 <w:numbering xmlns:wpc="http://schemas.microsoft.com/office/word/2010/wordprocessingCanvas" xmlns:cx="http://schemas.microsoft.com/office/drawing/2014/chartex" xmlns:cx1="http://schemas.microsoft.com/office/drawing/2015/9/8/chartex" xmlns:cx2="http://schemas.microsoft.com/office/drawing/2015/10/21/chartex" xmlns:cx3="http://schemas.microsoft.com/office/drawing/2016/5/9/chartex" xmlns:cx4="http://schemas.microsoft.com/office/drawing/2016/5/10/chartex" xmlns:cx5="http://schemas.microsoft.com/office/drawing/2016/5/11/chartex" xmlns:cx6="http://schemas.microsoft.com/office/drawing/2016/5/12/chartex" xmlns:cx7="http://schemas.microsoft.com/office/drawing/2016/5/13/chartex" xmlns:cx8="http://schemas.microsoft.com/office/drawing/2016/5/14/chartex" xmlns:mc="http://schemas.openxmlformats.org/markup-compatibility/2006" xmlns:aink="http://schemas.microsoft.com/office/drawing/2016/ink" xmlns:am3d="http://schemas.microsoft.com/office/drawing/2017/model3d" xmlns:o="urn:schemas-microsoft-com:office:office" xmlns:oel="http://schemas.microsoft.com/office/2019/extlst" xmlns:r="http://schemas.openxmlformats.org/officeDocument/2006/relationships" xmlns:m="http://schemas.openxmlformats.org/officeDocument/2006/math" xmlns:v="urn:schemas-microsoft-com:vml" xmlns:wp14="http://schemas.microsoft.com/office/word/2010/wordprocessingDrawing" xmlns:wp="http://schemas.openxmlformats.org/drawingml/2006/wordprocessingDrawing" xmlns:w10="urn:schemas-microsoft-com:office:word" xmlns:w="http://schemas.openxmlformats.org/wordprocessingml/2006/main" xmlns:w14="http://schemas.microsoft.com/office/word/2010/wordml" xmlns:w15="http://schemas.microsoft.com/office/word/2012/wordml" xmlns:w16cex="http://schemas.microsoft.com/office/word/2018/wordml/cex" xmlns:w16cid="http://schemas.microsoft.com/office/word/2016/wordml/cid" xmlns:w16="http://schemas.microsoft.com/office/word/2018/wordml" xmlns:w16du="http://schemas.microsoft.com/office/word/2023/wordml/word16du" xmlns:w16sdtdh="http://schemas.microsoft.com/office/word/2020/wordml/sdtdatahash" xmlns:w16sdtfl="http://schemas.microsoft.com/office/word/2024/wordml/sdtformatlock" xmlns:w16se="http://schemas.microsoft.com/office/word/2015/wordml/symex" xmlns:wpg="http://schemas.microsoft.com/office/word/2010/wordprocessingGroup" xmlns:wpi="http://schemas.microsoft.com/office/word/2010/wordprocessingInk" xmlns:wne="http://schemas.microsoft.com/office/word/2006/wordml" xmlns:wps="http://schemas.microsoft.com/office/word/2010/wordprocessingShape" mc:Ignorable="w14 w15 w16se w16cid w16 w16cex w16sdtdh w16sdtfl w16du wp14">
   <w:abstractNum w:abstractNumId="0" w15:restartNumberingAfterBreak="0">
-    <w:nsid w:val="65070791"/>
+    <w:nsid w:val="1E7C25F6"/>
     <w:multiLevelType w:val="multilevel"/>
     <w:tmpl w:val="3F5288A8"/>
     <w:lvl w:ilvl="0">
@@ -3470,7 +3817,131 @@
       </w:rPr>
     </w:lvl>
   </w:abstractNum>
+  <w:abstractNum w:abstractNumId="1" w15:restartNumberingAfterBreak="0">
+    <w:nsid w:val="65070791"/>
+    <w:multiLevelType w:val="multilevel"/>
+    <w:tmpl w:val="3F5288A8"/>
+    <w:lvl w:ilvl="0">
+      <w:start w:val="1"/>
+      <w:numFmt w:val="decimal"/>
+      <w:lvlText w:val="%1."/>
+      <w:lvlJc w:val="left"/>
+      <w:pPr>
+        <w:ind w:left="720" w:hanging="360"/>
+      </w:pPr>
+      <w:rPr>
+        <w:rFonts w:hint="default"/>
+      </w:rPr>
+    </w:lvl>
+    <w:lvl w:ilvl="1">
+      <w:start w:val="2"/>
+      <w:numFmt w:val="decimal"/>
+      <w:isLgl/>
+      <w:lvlText w:val="%1.%2"/>
+      <w:lvlJc w:val="left"/>
+      <w:pPr>
+        <w:ind w:left="732" w:hanging="372"/>
+      </w:pPr>
+      <w:rPr>
+        <w:rFonts w:hint="default"/>
+      </w:rPr>
+    </w:lvl>
+    <w:lvl w:ilvl="2">
+      <w:start w:val="1"/>
+      <w:numFmt w:val="decimal"/>
+      <w:isLgl/>
+      <w:lvlText w:val="%1.%2.%3"/>
+      <w:lvlJc w:val="left"/>
+      <w:pPr>
+        <w:ind w:left="1080" w:hanging="720"/>
+      </w:pPr>
+      <w:rPr>
+        <w:rFonts w:hint="default"/>
+      </w:rPr>
+    </w:lvl>
+    <w:lvl w:ilvl="3">
+      <w:start w:val="1"/>
+      <w:numFmt w:val="decimal"/>
+      <w:isLgl/>
+      <w:lvlText w:val="%1.%2.%3.%4"/>
+      <w:lvlJc w:val="left"/>
+      <w:pPr>
+        <w:ind w:left="1440" w:hanging="1080"/>
+      </w:pPr>
+      <w:rPr>
+        <w:rFonts w:hint="default"/>
+      </w:rPr>
+    </w:lvl>
+    <w:lvl w:ilvl="4">
+      <w:start w:val="1"/>
+      <w:numFmt w:val="decimal"/>
+      <w:isLgl/>
+      <w:lvlText w:val="%1.%2.%3.%4.%5"/>
+      <w:lvlJc w:val="left"/>
+      <w:pPr>
+        <w:ind w:left="1440" w:hanging="1080"/>
+      </w:pPr>
+      <w:rPr>
+        <w:rFonts w:hint="default"/>
+      </w:rPr>
+    </w:lvl>
+    <w:lvl w:ilvl="5">
+      <w:start w:val="1"/>
+      <w:numFmt w:val="decimal"/>
+      <w:isLgl/>
+      <w:lvlText w:val="%1.%2.%3.%4.%5.%6"/>
+      <w:lvlJc w:val="left"/>
+      <w:pPr>
+        <w:ind w:left="1800" w:hanging="1440"/>
+      </w:pPr>
+      <w:rPr>
+        <w:rFonts w:hint="default"/>
+      </w:rPr>
+    </w:lvl>
+    <w:lvl w:ilvl="6">
+      <w:start w:val="1"/>
+      <w:numFmt w:val="decimal"/>
+      <w:isLgl/>
+      <w:lvlText w:val="%1.%2.%3.%4.%5.%6.%7"/>
+      <w:lvlJc w:val="left"/>
+      <w:pPr>
+        <w:ind w:left="1800" w:hanging="1440"/>
+      </w:pPr>
+      <w:rPr>
+        <w:rFonts w:hint="default"/>
+      </w:rPr>
+    </w:lvl>
+    <w:lvl w:ilvl="7">
+      <w:start w:val="1"/>
+      <w:numFmt w:val="decimal"/>
+      <w:isLgl/>
+      <w:lvlText w:val="%1.%2.%3.%4.%5.%6.%7.%8"/>
+      <w:lvlJc w:val="left"/>
+      <w:pPr>
+        <w:ind w:left="2160" w:hanging="1800"/>
+      </w:pPr>
+      <w:rPr>
+        <w:rFonts w:hint="default"/>
+      </w:rPr>
+    </w:lvl>
+    <w:lvl w:ilvl="8">
+      <w:start w:val="1"/>
+      <w:numFmt w:val="decimal"/>
+      <w:isLgl/>
+      <w:lvlText w:val="%1.%2.%3.%4.%5.%6.%7.%8.%9"/>
+      <w:lvlJc w:val="left"/>
+      <w:pPr>
+        <w:ind w:left="2160" w:hanging="1800"/>
+      </w:pPr>
+      <w:rPr>
+        <w:rFonts w:hint="default"/>
+      </w:rPr>
+    </w:lvl>
+  </w:abstractNum>
   <w:num w:numId="1" w16cid:durableId="1289820037">
+    <w:abstractNumId w:val="1"/>
+  </w:num>
+  <w:num w:numId="2" w16cid:durableId="19284713">
     <w:abstractNumId w:val="0"/>
   </w:num>
 </w:numbering>
@@ -4079,7 +4550,6 @@
   <w:style w:type="character" w:default="1" w:styleId="DefaultParagraphFont">
     <w:name w:val="Default Paragraph Font"/>
     <w:uiPriority w:val="1"/>
-    <w:semiHidden/>
     <w:unhideWhenUsed/>
   </w:style>
   <w:style w:type="table" w:default="1" w:styleId="TableNormal">

</xml_diff>